<commit_message>
docs: update all Flowfiy docs for BYOK + INDIE plan hybrid model
- New INDIE plan ($20/mo, BYOK only, 2,500 leads/month)
- FREE plan now requires BYOK (own Anthropic API key)
- STARTER/GROWTH/AGENCY: Central Managed API or BYOK choice
- Central API mode: temperature=0, tight limits, optimized outputs
- BYOK mode: natural Claude behavior, user pays Anthropic directly
- Updated generation limits: Starter 2,500 | Growth 7,500 | Agency Unlimited
- Updated pricing: Growth $119/mo (was $99) | Agency $299/mo (was $249)
- Free tier: 100/month (was 50 lifetime)
- Gross margin notes: ~90% BYOK / ~68% Central / ~75% blended
- Token budget system documented (Starter 6M | Growth 20M | Agency unlimited)
- Add launch/ content files (Reddit, HN, LinkedIn, cold DM templates)
- Add Flowfiy_Token_Cost_Analysis.docx and Flowfiy_Tech_Stack_v2.docx

Co-Authored-By: Claude Sonnet 4.6 <noreply@anthropic.com>
</commit_message>
<xml_diff>
--- a/Flowfiy_Architecture.docx
+++ b/Flowfiy_Architecture.docx
@@ -144,7 +144,7 @@
           <w:sz w:val="22"/>
           <w:szCs w:val="22"/>
         </w:rPr>
-        <w:t xml:space="preserve">Flowfiy is a multi-tenant B2B SaaS platform that automates the entire outbound sales pipeline using a five-stage AI agent system powered by Anthropic’s Claude. The platform follows a Bring Your Own Key (BYOK) model — users supply their own API credentials for Claude, Apollo, Apify, Gmail, and Calendly — keeping API costs off-platform and enabling unlimited scale.</w:t>
+        <w:t xml:space="preserve">Flowfiy is a multi-tenant B2B SaaS platform that automates the entire outbound sales pipeline using a five-stage AI agent system powered by Anthropic’s Claude. The platform follows a Managed AI model — Flowfiy manages Claude centrally while users supply their own credentials for Apollo, Apify, Gmail, and Calendly — keeping API costs off-platform and enabling unlimited scale.</w:t>
       </w:r>
     </w:p>
     <w:p>
@@ -222,7 +222,7 @@
           <w:sz w:val="22"/>
           <w:szCs w:val="22"/>
         </w:rPr>
-        <w:t xml:space="preserve">BYOK model — no markup on Claude, Apollo, or Apify API costs</w:t>
+        <w:t>Flexible AI — Use Flowfiy's Managed Central API or bring your own Anthropic key (BYOK)</w:t>
       </w:r>
     </w:p>
     <w:p>
@@ -240,7 +240,7 @@
           <w:sz w:val="22"/>
           <w:szCs w:val="22"/>
         </w:rPr>
-        <w:t xml:space="preserve">50 free lead generations to start — no credit card required</w:t>
+        <w:t>100 free lead generations per month — no credit card required</w:t>
       </w:r>
     </w:p>
     <w:p>
@@ -554,7 +554,7 @@
                 <w:sz w:val="20"/>
                 <w:szCs w:val="20"/>
               </w:rPr>
-              <w:t xml:space="preserve">Anthropic Claude (user-supplied API key)</w:t>
+              <w:t>Anthropic Claude (Central Managed API for STARTER+ by default; BYOK option for all paid plans; required for FREE/INDIE)</w:t>
             </w:r>
           </w:p>
         </w:tc>
@@ -668,7 +668,7 @@
                 <w:sz w:val="20"/>
                 <w:szCs w:val="20"/>
               </w:rPr>
-              <w:t xml:space="preserve">Seat-based subscription (Razorpay) + per-generation usage model</w:t>
+              <w:t>Seat-based subscription (Razorpay) + per-lead generation limits per plan. Central API usage tracked via monthly token budget.</w:t>
             </w:r>
           </w:p>
         </w:tc>
@@ -725,7 +725,7 @@
                 <w:sz w:val="20"/>
                 <w:szCs w:val="20"/>
               </w:rPr>
-              <w:t xml:space="preserve">FREE (50 leads) → STARTER → GROWTH → AGENCY</w:t>
+              <w:t>FREE (100/mo, BYOK) | INDIE ($20, BYOK) | STARTER ($49) | GROWTH ($119) | AGENCY ($299)</w:t>
             </w:r>
           </w:p>
         </w:tc>
@@ -5758,7 +5758,7 @@
           <w:sz w:val="36"/>
           <w:szCs w:val="36"/>
         </w:rPr>
-        <w:t xml:space="preserve">5. Bring Your Own Key (BYOK) System</w:t>
+        <w:t xml:space="preserve">5. Managed AI System</w:t>
       </w:r>
     </w:p>
     <w:p>
@@ -7598,7 +7598,7 @@
                 <w:sz w:val="20"/>
                 <w:szCs w:val="20"/>
               </w:rPr>
-              <w:t xml:space="preserve">Claude (user’s key)</w:t>
+              <w:t>Claude Sonnet (Central API or org BYOK key)</w:t>
             </w:r>
           </w:p>
         </w:tc>
@@ -7709,7 +7709,7 @@
                 <w:sz w:val="20"/>
                 <w:szCs w:val="20"/>
               </w:rPr>
-              <w:t xml:space="preserve">Claude (user’s key)</w:t>
+              <w:t>Claude Sonnet (Central API or org BYOK key)</w:t>
             </w:r>
           </w:p>
         </w:tc>
@@ -7820,7 +7820,7 @@
                 <w:sz w:val="20"/>
                 <w:szCs w:val="20"/>
               </w:rPr>
-              <w:t xml:space="preserve">Claude (user’s key)</w:t>
+              <w:t>Claude Sonnet (Central API or org BYOK key)</w:t>
             </w:r>
           </w:p>
         </w:tc>
@@ -7931,7 +7931,7 @@
                 <w:sz w:val="20"/>
                 <w:szCs w:val="20"/>
               </w:rPr>
-              <w:t xml:space="preserve">Claude (user’s key)</w:t>
+              <w:t>Claude Sonnet (Central API or org BYOK key)</w:t>
             </w:r>
           </w:p>
         </w:tc>
@@ -14214,7 +14214,7 @@
                 <w:sz w:val="20"/>
                 <w:szCs w:val="20"/>
               </w:rPr>
-              <w:t xml:space="preserve">FREE</w:t>
+              <w:t>FREE</w:t>
             </w:r>
           </w:p>
         </w:tc>
@@ -14241,7 +14241,7 @@
                 <w:sz w:val="20"/>
                 <w:szCs w:val="20"/>
               </w:rPr>
-              <w:t xml:space="preserve">50 total (lifetime)</w:t>
+              <w:t>100/month</w:t>
             </w:r>
           </w:p>
         </w:tc>
@@ -14268,7 +14268,7 @@
                 <w:sz w:val="20"/>
                 <w:szCs w:val="20"/>
               </w:rPr>
-              <w:t xml:space="preserve">1 seat</w:t>
+              <w:t>1 seat</w:t>
             </w:r>
           </w:p>
         </w:tc>
@@ -14295,7 +14295,7 @@
                 <w:sz w:val="20"/>
                 <w:szCs w:val="20"/>
               </w:rPr>
-              <w:t xml:space="preserve">Individuals evaluating the platform</w:t>
+              <w:t>Individuals evaluating the platform (BYOK only)</w:t>
             </w:r>
           </w:p>
         </w:tc>
@@ -14325,7 +14325,7 @@
                 <w:sz w:val="20"/>
                 <w:szCs w:val="20"/>
               </w:rPr>
-              <w:t xml:space="preserve">STARTER</w:t>
+              <w:t>INDIE</w:t>
             </w:r>
           </w:p>
         </w:tc>
@@ -14352,7 +14352,7 @@
                 <w:sz w:val="20"/>
                 <w:szCs w:val="20"/>
               </w:rPr>
-              <w:t xml:space="preserve">500/month</w:t>
+              <w:t>2,500/month</w:t>
             </w:r>
           </w:p>
         </w:tc>
@@ -14379,7 +14379,7 @@
                 <w:sz w:val="20"/>
                 <w:szCs w:val="20"/>
               </w:rPr>
-              <w:t xml:space="preserve">3 seats</w:t>
+              <w:t>1 seat</w:t>
             </w:r>
           </w:p>
         </w:tc>
@@ -14406,7 +14406,7 @@
                 <w:sz w:val="20"/>
                 <w:szCs w:val="20"/>
               </w:rPr>
-              <w:t xml:space="preserve">Solo founders and SDRs</w:t>
+              <w:t>Solo operators — affordable BYOK plan ($20/mo)</w:t>
             </w:r>
           </w:p>
         </w:tc>
@@ -14436,7 +14436,7 @@
                 <w:sz w:val="20"/>
                 <w:szCs w:val="20"/>
               </w:rPr>
-              <w:t xml:space="preserve">GROWTH</w:t>
+              <w:t>STARTER</w:t>
             </w:r>
           </w:p>
         </w:tc>
@@ -14463,7 +14463,7 @@
                 <w:sz w:val="20"/>
                 <w:szCs w:val="20"/>
               </w:rPr>
-              <w:t xml:space="preserve">2,000/month</w:t>
+              <w:t>2,500/month</w:t>
             </w:r>
           </w:p>
         </w:tc>
@@ -14490,7 +14490,7 @@
                 <w:sz w:val="20"/>
                 <w:szCs w:val="20"/>
               </w:rPr>
-              <w:t xml:space="preserve">10 seats</w:t>
+              <w:t>3 seats</w:t>
             </w:r>
           </w:p>
         </w:tc>
@@ -14517,7 +14517,7 @@
                 <w:sz w:val="20"/>
                 <w:szCs w:val="20"/>
               </w:rPr>
-              <w:t xml:space="preserve">Growing sales teams</w:t>
+              <w:t>Solo founders and SDRs (Central API or BYOK)</w:t>
             </w:r>
           </w:p>
         </w:tc>
@@ -14547,7 +14547,7 @@
                 <w:sz w:val="20"/>
                 <w:szCs w:val="20"/>
               </w:rPr>
-              <w:t xml:space="preserve">AGENCY</w:t>
+              <w:t>GROWTH</w:t>
             </w:r>
           </w:p>
         </w:tc>
@@ -14574,7 +14574,7 @@
                 <w:sz w:val="20"/>
                 <w:szCs w:val="20"/>
               </w:rPr>
-              <w:t xml:space="preserve">10,000/month</w:t>
+              <w:t>7,500/month</w:t>
             </w:r>
           </w:p>
         </w:tc>
@@ -14601,7 +14601,7 @@
                 <w:sz w:val="20"/>
                 <w:szCs w:val="20"/>
               </w:rPr>
-              <w:t xml:space="preserve">Unlimited</w:t>
+              <w:t>10 seats</w:t>
             </w:r>
           </w:p>
         </w:tc>
@@ -14628,7 +14628,118 @@
                 <w:sz w:val="20"/>
                 <w:szCs w:val="20"/>
               </w:rPr>
-              <w:t xml:space="preserve">Agencies managing multiple clients</w:t>
+              <w:t>Growing sales teams (Central API or BYOK)</w:t>
+            </w:r>
+          </w:p>
+        </w:tc>
+      </w:tr>
+      <w:tr>
+        <w:tc>
+          <w:tcPr>
+            <w:tcW w:type="dxa" w:w="1500"/>
+            <w:tcBorders>
+              <w:top w:val="single" w:color="D1D5DB" w:sz="1"/>
+              <w:left w:val="single" w:color="D1D5DB" w:sz="1"/>
+              <w:bottom w:val="single" w:color="D1D5DB" w:sz="1"/>
+              <w:right w:val="single" w:color="D1D5DB" w:sz="1"/>
+            </w:tcBorders>
+            <w:shd w:fill="F5F3FF" w:val="clear"/>
+            <w:tcMar>
+              <w:top w:type="dxa" w:w="80"/>
+              <w:left w:type="dxa" w:w="140"/>
+              <w:bottom w:type="dxa" w:w="80"/>
+              <w:right w:type="dxa" w:w="140"/>
+            </w:tcMar>
+          </w:tcPr>
+          <w:p>
+            <w:r>
+              <w:rPr>
+                <w:rFonts w:ascii="Calibri" w:cs="Calibri" w:eastAsia="Calibri" w:hAnsi="Calibri"/>
+                <w:sz w:val="20"/>
+                <w:szCs w:val="20"/>
+              </w:rPr>
+              <w:t>AGENCY</w:t>
+            </w:r>
+          </w:p>
+        </w:tc>
+        <w:tc>
+          <w:tcPr>
+            <w:tcW w:type="dxa" w:w="2000"/>
+            <w:tcBorders>
+              <w:top w:val="single" w:color="D1D5DB" w:sz="1"/>
+              <w:left w:val="single" w:color="D1D5DB" w:sz="1"/>
+              <w:bottom w:val="single" w:color="D1D5DB" w:sz="1"/>
+              <w:right w:val="single" w:color="D1D5DB" w:sz="1"/>
+            </w:tcBorders>
+            <w:tcMar>
+              <w:top w:type="dxa" w:w="80"/>
+              <w:left w:type="dxa" w:w="140"/>
+              <w:bottom w:type="dxa" w:w="80"/>
+              <w:right w:type="dxa" w:w="140"/>
+            </w:tcMar>
+          </w:tcPr>
+          <w:p>
+            <w:r>
+              <w:rPr>
+                <w:rFonts w:ascii="Calibri" w:cs="Calibri" w:eastAsia="Calibri" w:hAnsi="Calibri"/>
+                <w:sz w:val="20"/>
+                <w:szCs w:val="20"/>
+              </w:rPr>
+              <w:t>Unlimited</w:t>
+            </w:r>
+          </w:p>
+        </w:tc>
+        <w:tc>
+          <w:tcPr>
+            <w:tcW w:type="dxa" w:w="1500"/>
+            <w:tcBorders>
+              <w:top w:val="single" w:color="D1D5DB" w:sz="1"/>
+              <w:left w:val="single" w:color="D1D5DB" w:sz="1"/>
+              <w:bottom w:val="single" w:color="D1D5DB" w:sz="1"/>
+              <w:right w:val="single" w:color="D1D5DB" w:sz="1"/>
+            </w:tcBorders>
+            <w:tcMar>
+              <w:top w:type="dxa" w:w="80"/>
+              <w:left w:type="dxa" w:w="140"/>
+              <w:bottom w:type="dxa" w:w="80"/>
+              <w:right w:type="dxa" w:w="140"/>
+            </w:tcMar>
+          </w:tcPr>
+          <w:p>
+            <w:r>
+              <w:rPr>
+                <w:rFonts w:ascii="Calibri" w:cs="Calibri" w:eastAsia="Calibri" w:hAnsi="Calibri"/>
+                <w:sz w:val="20"/>
+                <w:szCs w:val="20"/>
+              </w:rPr>
+              <w:t>Unlimited</w:t>
+            </w:r>
+          </w:p>
+        </w:tc>
+        <w:tc>
+          <w:tcPr>
+            <w:tcW w:type="dxa" w:w="4360"/>
+            <w:tcBorders>
+              <w:top w:val="single" w:color="D1D5DB" w:sz="1"/>
+              <w:left w:val="single" w:color="D1D5DB" w:sz="1"/>
+              <w:bottom w:val="single" w:color="D1D5DB" w:sz="1"/>
+              <w:right w:val="single" w:color="D1D5DB" w:sz="1"/>
+            </w:tcBorders>
+            <w:tcMar>
+              <w:top w:type="dxa" w:w="80"/>
+              <w:left w:type="dxa" w:w="140"/>
+              <w:bottom w:type="dxa" w:w="80"/>
+              <w:right w:type="dxa" w:w="140"/>
+            </w:tcMar>
+          </w:tcPr>
+          <w:p>
+            <w:r>
+              <w:rPr>
+                <w:rFonts w:ascii="Calibri" w:cs="Calibri" w:eastAsia="Calibri" w:hAnsi="Calibri"/>
+                <w:sz w:val="20"/>
+                <w:szCs w:val="20"/>
+              </w:rPr>
+              <w:t>Agencies managing multiple clients (Central API or BYOK)</w:t>
             </w:r>
           </w:p>
         </w:tc>
@@ -16795,7 +16906,7 @@
                 <w:sz w:val="20"/>
                 <w:szCs w:val="20"/>
               </w:rPr>
-              <w:t xml:space="preserve">Connect and validate BYOK credentials for all 5 integrations</w:t>
+              <w:t xml:space="preserve">Connect and validate Managed AI credentials for all 5 integrations</w:t>
             </w:r>
           </w:p>
         </w:tc>
@@ -18705,7 +18816,7 @@
                 <w:sz w:val="20"/>
                 <w:szCs w:val="20"/>
               </w:rPr>
-              <w:t xml:space="preserve">BYOK</w:t>
+              <w:t xml:space="preserve">Managed AI</w:t>
             </w:r>
           </w:p>
         </w:tc>
@@ -18732,7 +18843,7 @@
                 <w:sz w:val="20"/>
                 <w:szCs w:val="20"/>
               </w:rPr>
-              <w:t xml:space="preserve">Bring Your Own Key — users provide their own API credentials rather than paying platform markup</w:t>
+              <w:t>AI Engine Mode — either Central API (Flowfiy manages ANTHROPIC_API_KEY) or BYOK (org provides own Anthropic key). Configurable per org via apiMode field.</w:t>
             </w:r>
           </w:p>
         </w:tc>

</xml_diff>